<commit_message>
docs(presentation): AI 기술 Q&A 집중 대비 섹션 추가 (대본 docx+md)
</commit_message>
<xml_diff>
--- a/docs/presentation/StudyReel_발표대본_2분.docx
+++ b/docs/presentation/StudyReel_발표대본_2분.docx
@@ -1042,6 +1042,331 @@
       </w:r>
     </w:p>
     <w:p>
+      <w:r>
+        <w:br w:type="page"/>
+      </w:r>
+    </w:p>
+    <w:p>
+      <w:pPr>
+        <w:spacing w:after="40" w:before="0"/>
+      </w:pPr>
+      <w:r>
+        <w:rPr>
+          <w:rFonts w:ascii="맑은 고딕" w:hAnsi="맑은 고딕" w:eastAsia="맑은 고딕"/>
+          <w:b/>
+          <w:i w:val="0"/>
+          <w:color w:val="191F28"/>
+          <w:sz w:val="28"/>
+        </w:rPr>
+        <w:t>AI 기술 관련 Q&amp;A (집중 대비)</w:t>
+      </w:r>
+    </w:p>
+    <w:p>
+      <w:pPr>
+        <w:spacing w:after="120" w:before="0"/>
+      </w:pPr>
+      <w:r>
+        <w:rPr>
+          <w:rFonts w:ascii="맑은 고딕" w:hAnsi="맑은 고딕" w:eastAsia="맑은 고딕"/>
+          <w:b w:val="0"/>
+          <w:i w:val="0"/>
+          <w:color w:val="6B7684"/>
+          <w:sz w:val="20"/>
+        </w:rPr>
+        <w:t>교수님·청중 질문이 AI 활용에 몰릴 가능성이 큼. AI 사용은 숨기면 감점, 솔직하게 ‘무엇을 AI가 했고 내가 무엇을 검증·판단했는지’ 말하면 가점.</w:t>
+      </w:r>
+    </w:p>
+    <w:tbl>
+      <w:tblPr>
+        <w:tblW w:type="auto" w:w="0"/>
+        <w:jc w:val="center"/>
+        <w:tblLook w:firstColumn="1" w:firstRow="1" w:lastColumn="0" w:lastRow="0" w:noHBand="0" w:noVBand="1" w:val="04A0"/>
+      </w:tblPr>
+      <w:tblGrid>
+        <w:gridCol w:w="9746"/>
+      </w:tblGrid>
+      <w:tr>
+        <w:tc>
+          <w:tcPr>
+            <w:tcW w:type="dxa" w:w="9354"/>
+            <w:shd w:val="clear" w:fill="FFF3E8"/>
+          </w:tcPr>
+          <w:p>
+            <w:pPr>
+              <w:spacing w:after="40"/>
+            </w:pPr>
+            <w:r/>
+            <w:r>
+              <w:rPr>
+                <w:rFonts w:ascii="맑은 고딕" w:hAnsi="맑은 고딕" w:eastAsia="맑은 고딕"/>
+                <w:b/>
+                <w:color w:val="D96A1E"/>
+                <w:sz w:val="21"/>
+              </w:rPr>
+              <w:t>황금 답변 공식 : “이 부분은 AI Agent가 생성했고, 저는 [무엇]을 검토·검증·수정했습니다.”</w:t>
+            </w:r>
+          </w:p>
+        </w:tc>
+      </w:tr>
+    </w:tbl>
+    <w:p>
+      <w:pPr>
+        <w:spacing w:after="80" w:before="0"/>
+      </w:pPr>
+    </w:p>
+    <w:p>
+      <w:pPr>
+        <w:spacing w:before="100" w:after="20"/>
+      </w:pPr>
+      <w:r>
+        <w:rPr>
+          <w:rFonts w:ascii="맑은 고딕" w:hAnsi="맑은 고딕" w:eastAsia="맑은 고딕"/>
+          <w:b/>
+          <w:color w:val="3182F6"/>
+          <w:sz w:val="22"/>
+        </w:rPr>
+        <w:t>Q. AI Agent를 구체적으로 어떻게 활용했나요?</w:t>
+      </w:r>
+    </w:p>
+    <w:p>
+      <w:pPr>
+        <w:spacing w:after="60" w:line="288" w:lineRule="auto"/>
+        <w:ind w:left="283"/>
+      </w:pPr>
+      <w:r>
+        <w:rPr>
+          <w:rFonts w:ascii="맑은 고딕" w:hAnsi="맑은 고딕" w:eastAsia="맑은 고딕"/>
+          <w:color w:val="191F28"/>
+          <w:sz w:val="21"/>
+        </w:rPr>
+        <w:t>A. Claude Code를 메인 페어 프로그래머로 써서 구현·디버깅·테스트 작성을 함께했고, 막힌 문제는 GPT·Gemini에 따로 물어 대안을 모은 뒤 다시 교차검증했습니다. AI를 ‘코드 생성기’가 아니라 ‘여러 관점을 굴려 검증하는 워크플로우’로 썼습니다.</w:t>
+      </w:r>
+    </w:p>
+    <w:p>
+      <w:pPr>
+        <w:spacing w:before="100" w:after="20"/>
+      </w:pPr>
+      <w:r>
+        <w:rPr>
+          <w:rFonts w:ascii="맑은 고딕" w:hAnsi="맑은 고딕" w:eastAsia="맑은 고딕"/>
+          <w:b/>
+          <w:color w:val="3182F6"/>
+          <w:sz w:val="22"/>
+        </w:rPr>
+        <w:t>Q. 어디까지 AI가 만들고, 어디부터 본인이 했나요?  (배점 큼)</w:t>
+      </w:r>
+    </w:p>
+    <w:p>
+      <w:pPr>
+        <w:spacing w:after="60" w:line="288" w:lineRule="auto"/>
+        <w:ind w:left="283"/>
+      </w:pPr>
+      <w:r>
+        <w:rPr>
+          <w:rFonts w:ascii="맑은 고딕" w:hAnsi="맑은 고딕" w:eastAsia="맑은 고딕"/>
+          <w:color w:val="191F28"/>
+          <w:sz w:val="21"/>
+        </w:rPr>
+        <w:t>A. 피드·캐시·라우팅 같은 구조 코드는 AI가 초안을 생성했고, 저는 ① 무엇을 만들지 결정(요구·우선순위) ② AI가 틀렸을 때 판단·교정 ③ 실기기 검증을 맡았습니다. 핵심 난제 error 152 돌파는 제가 실기기에서 재현하고 방향을 잡아 해결했습니다.</w:t>
+      </w:r>
+    </w:p>
+    <w:p>
+      <w:pPr>
+        <w:spacing w:before="100" w:after="20"/>
+      </w:pPr>
+      <w:r>
+        <w:rPr>
+          <w:rFonts w:ascii="맑은 고딕" w:hAnsi="맑은 고딕" w:eastAsia="맑은 고딕"/>
+          <w:b/>
+          <w:color w:val="3182F6"/>
+          <w:sz w:val="22"/>
+        </w:rPr>
+        <w:t>Q. AI가 헛발질한 사례가 있나요?  (가산점 기회)</w:t>
+      </w:r>
+    </w:p>
+    <w:p>
+      <w:pPr>
+        <w:spacing w:after="60" w:line="288" w:lineRule="auto"/>
+        <w:ind w:left="283"/>
+      </w:pPr>
+      <w:r>
+        <w:rPr>
+          <w:rFonts w:ascii="맑은 고딕" w:hAnsi="맑은 고딕" w:eastAsia="맑은 고딕"/>
+          <w:color w:val="191F28"/>
+          <w:sz w:val="21"/>
+        </w:rPr>
+        <w:t>A. 있습니다. error 152를 두고 AI가 ‘WebView가 영상을 합성 못 한다 / autoplay가 막힌다’로 진단했는데, 실기기에서 YouTube 에러 UI가 멀쩡히 뜨는 걸 보고 그 가설을 데이터로 폐기했습니다. 처음엔 ‘외부 YouTube 실행’을 권했지만 인앱이 핵심이라 방향을 고수했고, youtube-nocookie 호스트로 결국 풀었습니다.</w:t>
+      </w:r>
+    </w:p>
+    <w:p>
+      <w:pPr>
+        <w:spacing w:before="100" w:after="20"/>
+      </w:pPr>
+      <w:r>
+        <w:rPr>
+          <w:rFonts w:ascii="맑은 고딕" w:hAnsi="맑은 고딕" w:eastAsia="맑은 고딕"/>
+          <w:b/>
+          <w:color w:val="3182F6"/>
+          <w:sz w:val="22"/>
+        </w:rPr>
+        <w:t>Q. AI가 틀린 걸 어떻게 알아챘나요?</w:t>
+      </w:r>
+    </w:p>
+    <w:p>
+      <w:pPr>
+        <w:spacing w:after="60" w:line="288" w:lineRule="auto"/>
+        <w:ind w:left="283"/>
+      </w:pPr>
+      <w:r>
+        <w:rPr>
+          <w:rFonts w:ascii="맑은 고딕" w:hAnsi="맑은 고딕" w:eastAsia="맑은 고딕"/>
+          <w:color w:val="191F28"/>
+          <w:sz w:val="21"/>
+        </w:rPr>
+        <w:t>A. 추측을 믿지 않고 항상 증거로 확인했습니다. 152는 실기기 스크린샷·로그(오디오·코덱 상태)로, 캐시·필터 로직은 19개 단위 테스트로 검증했습니다. ‘AI가 그렇다더라’가 아니라 화면·로그·테스트로 끝을 봤습니다.</w:t>
+      </w:r>
+    </w:p>
+    <w:p>
+      <w:pPr>
+        <w:spacing w:before="100" w:after="20"/>
+      </w:pPr>
+      <w:r>
+        <w:rPr>
+          <w:rFonts w:ascii="맑은 고딕" w:hAnsi="맑은 고딕" w:eastAsia="맑은 고딕"/>
+          <w:b/>
+          <w:color w:val="3182F6"/>
+          <w:sz w:val="22"/>
+        </w:rPr>
+        <w:t>Q. 여러 AI를 왜, 어떻게 나눠 썼나요?  (Claude·GPT·Gemini)</w:t>
+      </w:r>
+    </w:p>
+    <w:p>
+      <w:pPr>
+        <w:spacing w:after="60" w:line="288" w:lineRule="auto"/>
+        <w:ind w:left="283"/>
+      </w:pPr>
+      <w:r>
+        <w:rPr>
+          <w:rFonts w:ascii="맑은 고딕" w:hAnsi="맑은 고딕" w:eastAsia="맑은 고딕"/>
+          <w:color w:val="191F28"/>
+          <w:sz w:val="21"/>
+        </w:rPr>
+        <w:t>A. Claude는 코드베이스 전체 맥락을 쥐고 구현·디버깅하는 메인으로, GPT·Gemini는 막혔을 때 다른 시각의 해법을 얻는 용도로 썼습니다. youtube-nocookie 해법도 외부 AI 제안 → 라이브러리 소스로 검증 → 실기기 확인 순으로 채택했습니다.</w:t>
+      </w:r>
+    </w:p>
+    <w:p>
+      <w:pPr>
+        <w:spacing w:before="100" w:after="20"/>
+      </w:pPr>
+      <w:r>
+        <w:rPr>
+          <w:rFonts w:ascii="맑은 고딕" w:hAnsi="맑은 고딕" w:eastAsia="맑은 고딕"/>
+          <w:b/>
+          <w:color w:val="3182F6"/>
+          <w:sz w:val="22"/>
+        </w:rPr>
+        <w:t>Q. AI 없이 이 코드를 이해·설명할 수 있나요?</w:t>
+      </w:r>
+    </w:p>
+    <w:p>
+      <w:pPr>
+        <w:spacing w:after="60" w:line="288" w:lineRule="auto"/>
+        <w:ind w:left="283"/>
+      </w:pPr>
+      <w:r>
+        <w:rPr>
+          <w:rFonts w:ascii="맑은 고딕" w:hAnsi="맑은 고딕" w:eastAsia="맑은 고딕"/>
+          <w:color w:val="191F28"/>
+          <w:sz w:val="21"/>
+        </w:rPr>
+        <w:t>A. 네. 각 레이어가 왜 그렇게 나뉘는지, 152가 왜 호스트 변경으로 풀리는지(origin이 host로도 쓰임) 소스 수준에서 설명할 수 있습니다. 모르는 부분은 솔직히 모른다고 말하고 확인하겠습니다.</w:t>
+      </w:r>
+    </w:p>
+    <w:p>
+      <w:pPr>
+        <w:spacing w:before="100" w:after="20"/>
+      </w:pPr>
+      <w:r>
+        <w:rPr>
+          <w:rFonts w:ascii="맑은 고딕" w:hAnsi="맑은 고딕" w:eastAsia="맑은 고딕"/>
+          <w:b/>
+          <w:color w:val="3182F6"/>
+          <w:sz w:val="22"/>
+        </w:rPr>
+        <w:t>Q. AI 활용이 실력에 해가 되지 않나요?</w:t>
+      </w:r>
+    </w:p>
+    <w:p>
+      <w:pPr>
+        <w:spacing w:after="60" w:line="288" w:lineRule="auto"/>
+        <w:ind w:left="283"/>
+      </w:pPr>
+      <w:r>
+        <w:rPr>
+          <w:rFonts w:ascii="맑은 고딕" w:hAnsi="맑은 고딕" w:eastAsia="맑은 고딕"/>
+          <w:color w:val="191F28"/>
+          <w:sz w:val="21"/>
+        </w:rPr>
+        <w:t>A. 오히려 판단력이 더 중요해졌습니다. 코드 타이핑은 줄었지만, 무엇을 만들지·AI가 틀렸는지·어떻게 검증할지를 정하는 능력이 결과를 갈랐습니다. 이번 152 해결이 그 예입니다.</w:t>
+      </w:r>
+    </w:p>
+    <w:p>
+      <w:pPr>
+        <w:spacing w:before="100" w:after="20"/>
+      </w:pPr>
+      <w:r>
+        <w:rPr>
+          <w:rFonts w:ascii="맑은 고딕" w:hAnsi="맑은 고딕" w:eastAsia="맑은 고딕"/>
+          <w:b/>
+          <w:color w:val="3182F6"/>
+          <w:sz w:val="22"/>
+        </w:rPr>
+        <w:t>Q. 토큰·비용은 어떻게 관리했나요?</w:t>
+      </w:r>
+    </w:p>
+    <w:p>
+      <w:pPr>
+        <w:spacing w:after="60" w:line="288" w:lineRule="auto"/>
+        <w:ind w:left="283"/>
+      </w:pPr>
+      <w:r>
+        <w:rPr>
+          <w:rFonts w:ascii="맑은 고딕" w:hAnsi="맑은 고딕" w:eastAsia="맑은 고딕"/>
+          <w:color w:val="191F28"/>
+          <w:sz w:val="21"/>
+        </w:rPr>
+        <w:t>A. Gemini 무료 한도 초과(429)로 AI 생성 카드를 포기하고 YouTube 피드로 피벗했고, YouTube API도 무료 할당량을 아끼려 Firestore 캐싱을 넣었습니다. 비용 제약을 설계 결정으로 반영했습니다.</w:t>
+      </w:r>
+    </w:p>
+    <w:p>
+      <w:pPr>
+        <w:spacing w:before="100" w:after="20"/>
+      </w:pPr>
+      <w:r>
+        <w:rPr>
+          <w:rFonts w:ascii="맑은 고딕" w:hAnsi="맑은 고딕" w:eastAsia="맑은 고딕"/>
+          <w:b/>
+          <w:color w:val="3182F6"/>
+          <w:sz w:val="22"/>
+        </w:rPr>
+        <w:t>Q. 본인만의 AI 활용 기법이 있나요?  (가산점)</w:t>
+      </w:r>
+    </w:p>
+    <w:p>
+      <w:pPr>
+        <w:spacing w:after="60" w:line="288" w:lineRule="auto"/>
+        <w:ind w:left="283"/>
+      </w:pPr>
+      <w:r>
+        <w:rPr>
+          <w:rFonts w:ascii="맑은 고딕" w:hAnsi="맑은 고딕" w:eastAsia="맑은 고딕"/>
+          <w:color w:val="191F28"/>
+          <w:sz w:val="21"/>
+        </w:rPr>
+        <w:t>A. ‘교차검증 + 증거 기반 종결’입니다. 한 AI의 답을 다른 AI·소스·실기기로 반드시 교차 확인하고, 화면·로그·테스트로 끝을 봅니다. AI의 오진을 데이터로 폐기하는 걸 습관화했습니다.</w:t>
+      </w:r>
+    </w:p>
+    <w:p>
       <w:pPr>
         <w:spacing w:before="40" w:after="160"/>
         <w:pBdr>

</xml_diff>